<commit_message>
docs(th2): chèn ảnh minh chứng thật vào báo cáo TH2 (#42)
- 7 ảnh chụp màn hình thật trong docs/TH2/evidence/: Terminal chạy hai lệnh git log trên d727856, trang New issue, issue #37, lần chạy CI 40737995933, trang Release v1.0.0 và mục Assets, bản cài từ gói v1.0.0 ở localhost:3300 (Playwright, script smoke-screenshot.mjs).
- Ảnh trang GitHub đã bỏ thanh tab và thanh bên của trình duyệt.
- Thay các khung [ẢNH: ...], build lại BaoCao_TH2.docx.
- Sửa mô tả config.yml (Blank issue vẫn có cho maintainer), cập nhật bảng PR (#41 đã merge, thêm #42), ghi annotation Ubuntu 26 của CI và trở ngại khi chụp ảnh.
</commit_message>
<xml_diff>
--- a/docs/TH2/BaoCao_TH2.docx
+++ b/docs/TH2/BaoCao_TH2.docx
@@ -360,7 +360,7 @@
               <w:t xml:space="preserve">TH2</w:t>
             </w:r>
             <w:r>
-              <w:t xml:space="preserve">: issue #21, #23, #25, #27, #28, #31, #33, #35, #38, #40; PR #22, #24, #26, #29, #30, #32, #34, #36, #39 và PR của báo cáo này</w:t>
+              <w:t xml:space="preserve">: issue #21, #23, #25, #27, #28, #31, #33, #35, #38, #40, #42; PR #22, #24, #26, #29, #30, #32, #34, #36, #39, #41 và PR chèn ảnh của #42</w:t>
             </w:r>
           </w:p>
         </w:tc>
@@ -1525,7 +1525,7 @@
       </w:r>
     </w:p>
     <w:bookmarkEnd w:id="21"/>
-    <w:bookmarkStart w:id="47" w:name="repository-và-git-workflow"/>
+    <w:bookmarkStart w:id="58" w:name="repository-và-git-workflow"/>
     <w:p>
       <w:pPr>
         <w:pStyle w:val="Heading1"/>
@@ -1733,7 +1733,7 @@
       </w:r>
     </w:p>
     <w:bookmarkEnd w:id="22"/>
-    <w:bookmarkStart w:id="42" w:name="issue-và-pr-thuộc-milestone-th2"/>
+    <w:bookmarkStart w:id="44" w:name="issue-và-pr-thuộc-milestone-th2"/>
     <w:p>
       <w:pPr>
         <w:pStyle w:val="Heading2"/>
@@ -2725,8 +2725,95 @@
             <w:pPr>
               <w:pStyle w:val="Compact"/>
             </w:pPr>
-            <w:r>
-              <w:t xml:space="preserve">PR của báo cáo này</w:t>
+            <w:hyperlink r:id="rId42">
+              <w:r>
+                <w:rPr>
+                  <w:rStyle w:val="Hyperlink"/>
+                </w:rPr>
+                <w:t xml:space="preserve">#41</w:t>
+              </w:r>
+            </w:hyperlink>
+          </w:p>
+        </w:tc>
+        <w:tc>
+          <w:tcPr/>
+          <w:p>
+            <w:pPr>
+              <w:pStyle w:val="Compact"/>
+            </w:pPr>
+            <w:r>
+              <w:t xml:space="preserve">pass 1m17s / pass 1m56s</w:t>
+            </w:r>
+          </w:p>
+        </w:tc>
+        <w:tc>
+          <w:tcPr/>
+          <w:p>
+            <w:pPr>
+              <w:pStyle w:val="Compact"/>
+            </w:pPr>
+            <w:r>
+              <w:rPr>
+                <w:rStyle w:val="VerbatimChar"/>
+              </w:rPr>
+              <w:t xml:space="preserve">37873be</w:t>
+            </w:r>
+            <w:r>
+              <w:t xml:space="preserve">, 29/10</w:t>
+            </w:r>
+          </w:p>
+        </w:tc>
+      </w:tr>
+      <w:tr>
+        <w:tc>
+          <w:tcPr/>
+          <w:p>
+            <w:pPr>
+              <w:pStyle w:val="Compact"/>
+            </w:pPr>
+            <w:hyperlink r:id="rId43">
+              <w:r>
+                <w:rPr>
+                  <w:rStyle w:val="Hyperlink"/>
+                </w:rPr>
+                <w:t xml:space="preserve">#42</w:t>
+              </w:r>
+            </w:hyperlink>
+          </w:p>
+        </w:tc>
+        <w:tc>
+          <w:tcPr/>
+          <w:p>
+            <w:pPr>
+              <w:pStyle w:val="Compact"/>
+            </w:pPr>
+            <w:r>
+              <w:t xml:space="preserve">Chèn ảnh minh chứng vào báo cáo</w:t>
+            </w:r>
+          </w:p>
+        </w:tc>
+        <w:tc>
+          <w:tcPr/>
+          <w:p>
+            <w:pPr>
+              <w:pStyle w:val="Compact"/>
+            </w:pPr>
+            <w:r>
+              <w:rPr>
+                <w:rStyle w:val="VerbatimChar"/>
+              </w:rPr>
+              <w:t xml:space="preserve">docs/42-th2-report-images</w:t>
+            </w:r>
+          </w:p>
+        </w:tc>
+        <w:tc>
+          <w:tcPr/>
+          <w:p>
+            <w:pPr>
+              <w:pStyle w:val="Compact"/>
+            </w:pPr>
+            <w:r>
+              <w:t xml:space="preserve">PR của bản cập nhật này</w:t>
             </w:r>
           </w:p>
         </w:tc>
@@ -2794,8 +2881,8 @@
         <w:t xml:space="preserve">Issue #21 tạo trước khi có form (chính issue này thêm form), nên được viết tay theo cấu trúc của form Task. Từ #23, mọi issue tạo bằng issue form: #23, #25, #27, #31, #33, #38, #40 dùng form Task; #28 và #35 dùng form Bug report; #37 dùng form Change Request. Ngoài Milestone TH2 không còn PR nào mở, trừ #5 (UC9) và #6 (UC10). Hai PR này có từ trước baseline và cố ý chưa merge.</w:t>
       </w:r>
     </w:p>
-    <w:bookmarkEnd w:id="42"/>
-    <w:bookmarkStart w:id="43" w:name="issue-form-và-pr-template"/>
+    <w:bookmarkEnd w:id="44"/>
+    <w:bookmarkStart w:id="48" w:name="issue-form-và-pr-template"/>
     <w:p>
       <w:pPr>
         <w:pStyle w:val="Heading2"/>
@@ -2963,7 +3050,31 @@
               <w:t xml:space="preserve">blank_issues_enabled: false</w:t>
             </w:r>
             <w:r>
-              <w:t xml:space="preserve">: mọi issue phải đi qua form</w:t>
+              <w:t xml:space="preserve">: người đóng góp phải dùng form. GitHub vẫn để</w:t>
+            </w:r>
+            <w:r>
+              <w:t xml:space="preserve"> </w:t>
+            </w:r>
+            <w:r>
+              <w:t xml:space="preserve">“Blank issue”</w:t>
+            </w:r>
+            <w:r>
+              <w:t xml:space="preserve"> </w:t>
+            </w:r>
+            <w:r>
+              <w:t xml:space="preserve">cho maintainer (nhãn</w:t>
+            </w:r>
+            <w:r>
+              <w:t xml:space="preserve"> </w:t>
+            </w:r>
+            <w:r>
+              <w:t xml:space="preserve">“Maintainers only”</w:t>
+            </w:r>
+            <w:r>
+              <w:t xml:space="preserve"> </w:t>
+            </w:r>
+            <w:r>
+              <w:t xml:space="preserve">trong ảnh dưới); quy ước của repo là không dùng</w:t>
             </w:r>
           </w:p>
         </w:tc>
@@ -3045,14 +3156,61 @@
     </w:p>
     <w:p>
       <w:pPr>
-        <w:pStyle w:val="BodyText"/>
-      </w:pPr>
-      <w:r>
-        <w:t xml:space="preserve">[ẢNH: evidence/issue-forms.png – trang New issue của repo, hiện 3 form Task, Bug report, Change Request]</w:t>
+        <w:pStyle w:val="CaptionedFigure"/>
+      </w:pPr>
+      <w:r>
+        <w:drawing>
+          <wp:inline>
+            <wp:extent cx="5334000" cy="1741394"/>
+            <wp:effectExtent b="0" l="0" r="0" t="0"/>
+            <wp:docPr descr="Trang New issue (github.com/HoangntDev/eoffice-hiu/issues/new/choose): 3 form Bug report, Change Request, Task" title="" id="46" name="Picture"/>
+            <a:graphic>
+              <a:graphicData uri="http://schemas.openxmlformats.org/drawingml/2006/picture">
+                <pic:pic>
+                  <pic:nvPicPr>
+                    <pic:cNvPr descr="evidence/issue-forms.png" id="47" name="Picture"/>
+                    <pic:cNvPicPr>
+                      <a:picLocks noChangeArrowheads="1" noChangeAspect="1"/>
+                    </pic:cNvPicPr>
+                  </pic:nvPicPr>
+                  <pic:blipFill>
+                    <a:blip r:embed="rId45"/>
+                    <a:stretch>
+                      <a:fillRect/>
+                    </a:stretch>
+                  </pic:blipFill>
+                  <pic:spPr bwMode="auto">
+                    <a:xfrm>
+                      <a:off x="0" y="0"/>
+                      <a:ext cx="5334000" cy="1741394"/>
+                    </a:xfrm>
+                    <a:prstGeom prst="rect">
+                      <a:avLst/>
+                    </a:prstGeom>
+                    <a:noFill/>
+                    <a:ln w="9525">
+                      <a:noFill/>
+                      <a:headEnd/>
+                      <a:tailEnd/>
+                    </a:ln>
+                  </pic:spPr>
+                </pic:pic>
+              </a:graphicData>
+            </a:graphic>
+          </wp:inline>
+        </w:drawing>
       </w:r>
     </w:p>
-    <w:bookmarkEnd w:id="43"/>
-    <w:bookmarkStart w:id="45" w:name="issue-cr-01"/>
+    <w:p>
+      <w:pPr>
+        <w:pStyle w:val="ImageCaption"/>
+      </w:pPr>
+      <w:r>
+        <w:t xml:space="preserve">Trang New issue (github.com/HoangntDev/eoffice-hiu/issues/new/choose): 3 form Bug report, Change Request, Task</w:t>
+      </w:r>
+    </w:p>
+    <w:bookmarkEnd w:id="48"/>
+    <w:bookmarkStart w:id="53" w:name="issue-cr-01"/>
     <w:p>
       <w:pPr>
         <w:pStyle w:val="Heading2"/>
@@ -3075,7 +3233,7 @@
       <w:r>
         <w:t xml:space="preserve"> </w:t>
       </w:r>
-      <w:hyperlink r:id="rId44">
+      <w:hyperlink r:id="rId49">
         <w:r>
           <w:rPr>
             <w:rStyle w:val="Hyperlink"/>
@@ -3224,48 +3382,106 @@
     </w:p>
     <w:p>
       <w:pPr>
-        <w:pStyle w:val="FirstParagraph"/>
-      </w:pPr>
-      <w:r>
-        <w:t xml:space="preserve">[ẢNH: evidence/cr-01-issue-37.png – issue #37 trên GitHub: tiêu đề, label change-request, Milestone TH4, trường</w:t>
-      </w:r>
-      <w:r>
-        <w:t xml:space="preserve"> </w:t>
-      </w:r>
-      <w:r>
-        <w:t xml:space="preserve">“Trao đổi với giảng viên”</w:t>
-      </w:r>
-      <w:r>
-        <w:t xml:space="preserve">]</w:t>
-      </w:r>
-    </w:p>
-    <w:bookmarkEnd w:id="45"/>
-    <w:bookmarkStart w:id="46" w:name="kiểm-chứng-lịch-sử-main-sau-baseline"/>
-    <w:p>
-      <w:pPr>
-        <w:pStyle w:val="Heading2"/>
-      </w:pPr>
-      <w:r>
-        <w:t xml:space="preserve">3.5 Kiểm chứng lịch sử</w:t>
-      </w:r>
-      <w:r>
-        <w:t xml:space="preserve"> </w:t>
-      </w:r>
-      <w:r>
-        <w:rPr>
-          <w:rStyle w:val="VerbatimChar"/>
-        </w:rPr>
-        <w:t xml:space="preserve">main</w:t>
-      </w:r>
-      <w:r>
-        <w:t xml:space="preserve"> </w:t>
-      </w:r>
-      <w:r>
-        <w:t xml:space="preserve">sau baseline</w:t>
+        <w:pStyle w:val="CaptionedFigure"/>
+      </w:pPr>
+      <w:r>
+        <w:drawing>
+          <wp:inline>
+            <wp:extent cx="5334000" cy="3081169"/>
+            <wp:effectExtent b="0" l="0" r="0" t="0"/>
+            <wp:docPr descr="Issue #37: tiêu đề, nhãn change-request, Milestone TH4, trường “Trao đổi với giảng viên” ghi chưa có phản hồi" title="" id="51" name="Picture"/>
+            <a:graphic>
+              <a:graphicData uri="http://schemas.openxmlformats.org/drawingml/2006/picture">
+                <pic:pic>
+                  <pic:nvPicPr>
+                    <pic:cNvPr descr="evidence/cr-01-issue-37.png" id="52" name="Picture"/>
+                    <pic:cNvPicPr>
+                      <a:picLocks noChangeArrowheads="1" noChangeAspect="1"/>
+                    </pic:cNvPicPr>
+                  </pic:nvPicPr>
+                  <pic:blipFill>
+                    <a:blip r:embed="rId50"/>
+                    <a:stretch>
+                      <a:fillRect/>
+                    </a:stretch>
+                  </pic:blipFill>
+                  <pic:spPr bwMode="auto">
+                    <a:xfrm>
+                      <a:off x="0" y="0"/>
+                      <a:ext cx="5334000" cy="3081169"/>
+                    </a:xfrm>
+                    <a:prstGeom prst="rect">
+                      <a:avLst/>
+                    </a:prstGeom>
+                    <a:noFill/>
+                    <a:ln w="9525">
+                      <a:noFill/>
+                      <a:headEnd/>
+                      <a:tailEnd/>
+                    </a:ln>
+                  </pic:spPr>
+                </pic:pic>
+              </a:graphicData>
+            </a:graphic>
+          </wp:inline>
+        </w:drawing>
       </w:r>
     </w:p>
     <w:p>
       <w:pPr>
+        <w:pStyle w:val="ImageCaption"/>
+      </w:pPr>
+      <w:r>
+        <w:t xml:space="preserve">Issue #37: tiêu đề, nhãn change-request, Milestone TH4, trường</w:t>
+      </w:r>
+      <w:r>
+        <w:t xml:space="preserve"> </w:t>
+      </w:r>
+      <w:r>
+        <w:t xml:space="preserve">“Trao đổi với giảng viên”</w:t>
+      </w:r>
+      <w:r>
+        <w:t xml:space="preserve"> </w:t>
+      </w:r>
+      <w:r>
+        <w:t xml:space="preserve">ghi chưa có phản hồi</w:t>
+      </w:r>
+    </w:p>
+    <w:p>
+      <w:pPr>
+        <w:pStyle w:val="BodyText"/>
+      </w:pPr>
+      <w:r>
+        <w:t xml:space="preserve">Ảnh chụp phần đầu issue. Toàn văn AC1–AC7 và phạm vi xem tại link #37.</w:t>
+      </w:r>
+    </w:p>
+    <w:bookmarkEnd w:id="53"/>
+    <w:bookmarkStart w:id="57" w:name="kiểm-chứng-lịch-sử-main-sau-baseline"/>
+    <w:p>
+      <w:pPr>
+        <w:pStyle w:val="Heading2"/>
+      </w:pPr>
+      <w:r>
+        <w:t xml:space="preserve">3.5 Kiểm chứng lịch sử</w:t>
+      </w:r>
+      <w:r>
+        <w:t xml:space="preserve"> </w:t>
+      </w:r>
+      <w:r>
+        <w:rPr>
+          <w:rStyle w:val="VerbatimChar"/>
+        </w:rPr>
+        <w:t xml:space="preserve">main</w:t>
+      </w:r>
+      <w:r>
+        <w:t xml:space="preserve"> </w:t>
+      </w:r>
+      <w:r>
+        <w:t xml:space="preserve">sau baseline</w:t>
+      </w:r>
+    </w:p>
+    <w:p>
+      <w:pPr>
         <w:pStyle w:val="FirstParagraph"/>
       </w:pPr>
       <w:r>
@@ -3321,10 +3537,13 @@
           <w:b/>
           <w:bCs/>
         </w:rPr>
-        <w:t xml:space="preserve">trước khi merge PR của báo cáo này</w:t>
-      </w:r>
-      <w:r>
-        <w:t xml:space="preserve">. Output lưu ở</w:t>
+        <w:t xml:space="preserve">trước khi merge PR #41</w:t>
+      </w:r>
+      <w:r>
+        <w:t xml:space="preserve"> </w:t>
+      </w:r>
+      <w:r>
+        <w:t xml:space="preserve">(báo cáo này). Output lưu ở</w:t>
       </w:r>
       <w:r>
         <w:t xml:space="preserve"> </w:t>
@@ -3517,17 +3736,114 @@
     </w:p>
     <w:p>
       <w:pPr>
-        <w:pStyle w:val="FirstParagraph"/>
-      </w:pPr>
-      <w:r>
-        <w:t xml:space="preserve">[ẢNH: evidence/git-log-first-parent.png – Terminal chạy hai lệnh trên, lệnh thứ hai không in dòng nào]</w:t>
+        <w:pStyle w:val="CaptionedFigure"/>
+      </w:pPr>
+      <w:r>
+        <w:drawing>
+          <wp:inline>
+            <wp:extent cx="5334000" cy="2719294"/>
+            <wp:effectExtent b="0" l="0" r="0" t="0"/>
+            <wp:docPr descr="Terminal chạy hai lệnh trên d727856; lệnh thứ hai không in dòng nào" title="" id="55" name="Picture"/>
+            <a:graphic>
+              <a:graphicData uri="http://schemas.openxmlformats.org/drawingml/2006/picture">
+                <pic:pic>
+                  <pic:nvPicPr>
+                    <pic:cNvPr descr="evidence/git-log-first-parent.png" id="56" name="Picture"/>
+                    <pic:cNvPicPr>
+                      <a:picLocks noChangeArrowheads="1" noChangeAspect="1"/>
+                    </pic:cNvPicPr>
+                  </pic:nvPicPr>
+                  <pic:blipFill>
+                    <a:blip r:embed="rId54"/>
+                    <a:stretch>
+                      <a:fillRect/>
+                    </a:stretch>
+                  </pic:blipFill>
+                  <pic:spPr bwMode="auto">
+                    <a:xfrm>
+                      <a:off x="0" y="0"/>
+                      <a:ext cx="5334000" cy="2719294"/>
+                    </a:xfrm>
+                    <a:prstGeom prst="rect">
+                      <a:avLst/>
+                    </a:prstGeom>
+                    <a:noFill/>
+                    <a:ln w="9525">
+                      <a:noFill/>
+                      <a:headEnd/>
+                      <a:tailEnd/>
+                    </a:ln>
+                  </pic:spPr>
+                </pic:pic>
+              </a:graphicData>
+            </a:graphic>
+          </wp:inline>
+        </w:drawing>
       </w:r>
     </w:p>
     <w:p>
       <w:pPr>
+        <w:pStyle w:val="ImageCaption"/>
+      </w:pPr>
+      <w:r>
+        <w:t xml:space="preserve">Terminal chạy hai lệnh trên d727856; lệnh thứ hai không in dòng nào</w:t>
+      </w:r>
+    </w:p>
+    <w:p>
+      <w:pPr>
         <w:pStyle w:val="BodyText"/>
       </w:pPr>
       <w:r>
+        <w:t xml:space="preserve">Ảnh chụp cửa sổ Terminal ngày 29/10/2026, chạy trên</w:t>
+      </w:r>
+      <w:r>
+        <w:t xml:space="preserve"> </w:t>
+      </w:r>
+      <w:r>
+        <w:rPr>
+          <w:rStyle w:val="VerbatimChar"/>
+        </w:rPr>
+        <w:t xml:space="preserve">d727856</w:t>
+      </w:r>
+      <w:r>
+        <w:t xml:space="preserve">, trước khi merge PR #41. Hai lệnh dùng</w:t>
+      </w:r>
+      <w:r>
+        <w:t xml:space="preserve"> </w:t>
+      </w:r>
+      <w:r>
+        <w:rPr>
+          <w:rStyle w:val="VerbatimChar"/>
+        </w:rPr>
+        <w:t xml:space="preserve">d727856</w:t>
+      </w:r>
+      <w:r>
+        <w:t xml:space="preserve"> </w:t>
+      </w:r>
+      <w:r>
+        <w:t xml:space="preserve">thay cho</w:t>
+      </w:r>
+      <w:r>
+        <w:t xml:space="preserve"> </w:t>
+      </w:r>
+      <w:r>
+        <w:rPr>
+          <w:rStyle w:val="VerbatimChar"/>
+        </w:rPr>
+        <w:t xml:space="preserve">main</w:t>
+      </w:r>
+      <w:r>
+        <w:t xml:space="preserve"> </w:t>
+      </w:r>
+      <w:r>
+        <w:t xml:space="preserve">để kết quả cố định đúng thời điểm đó.</w:t>
+      </w:r>
+    </w:p>
+    <w:p>
+      <w:pPr>
+        <w:pStyle w:val="BodyText"/>
+      </w:pPr>
+      <w:r>
         <w:t xml:space="preserve">Lệnh thứ nhất cho thấy, tính từ baseline,</w:t>
       </w:r>
       <w:r>
@@ -3543,7 +3859,43 @@
         <w:t xml:space="preserve"> </w:t>
       </w:r>
       <w:r>
-        <w:t xml:space="preserve">chỉ tiến lên qua merge commit của PR: 7 PR của TH1 và 9 PR của TH2. Lệnh thứ hai rỗng, nghĩa là</w:t>
+        <w:t xml:space="preserve">chỉ tiến lên qua merge commit của PR: 7 PR của TH1 và 9 PR của TH2 tính đến</w:t>
+      </w:r>
+      <w:r>
+        <w:t xml:space="preserve"> </w:t>
+      </w:r>
+      <w:r>
+        <w:rPr>
+          <w:rStyle w:val="VerbatimChar"/>
+        </w:rPr>
+        <w:t xml:space="preserve">d727856</w:t>
+      </w:r>
+      <w:r>
+        <w:t xml:space="preserve">. Sau đó</w:t>
+      </w:r>
+      <w:r>
+        <w:t xml:space="preserve"> </w:t>
+      </w:r>
+      <w:r>
+        <w:rPr>
+          <w:rStyle w:val="VerbatimChar"/>
+        </w:rPr>
+        <w:t xml:space="preserve">main</w:t>
+      </w:r>
+      <w:r>
+        <w:t xml:space="preserve"> </w:t>
+      </w:r>
+      <w:r>
+        <w:t xml:space="preserve">có thêm merge của PR #41 (</w:t>
+      </w:r>
+      <w:r>
+        <w:rPr>
+          <w:rStyle w:val="VerbatimChar"/>
+        </w:rPr>
+        <w:t xml:space="preserve">37873be</w:t>
+      </w:r>
+      <w:r>
+        <w:t xml:space="preserve">) và PR chèn ảnh của #42, cũng qua merge commit. Lệnh thứ hai rỗng, nghĩa là</w:t>
       </w:r>
       <w:r>
         <w:t xml:space="preserve"> </w:t>
@@ -3616,9 +3968,9 @@
         <w:t xml:space="preserve">trên origin vẫn trỏ đúng commit cũ.</w:t>
       </w:r>
     </w:p>
-    <w:bookmarkEnd w:id="46"/>
-    <w:bookmarkEnd w:id="47"/>
-    <w:bookmarkStart w:id="53" w:name="quản-lý-cấu-hình-và-dependency"/>
+    <w:bookmarkEnd w:id="57"/>
+    <w:bookmarkEnd w:id="58"/>
+    <w:bookmarkStart w:id="64" w:name="quản-lý-cấu-hình-và-dependency"/>
     <w:p>
       <w:pPr>
         <w:pStyle w:val="Heading1"/>
@@ -3659,7 +4011,7 @@
         <w:t xml:space="preserve">.</w:t>
       </w:r>
     </w:p>
-    <w:bookmarkStart w:id="48" w:name="bảng-kê-cấu-hình-trước-và-sau-khi-tách"/>
+    <w:bookmarkStart w:id="59" w:name="bảng-kê-cấu-hình-trước-và-sau-khi-tách"/>
     <w:p>
       <w:pPr>
         <w:pStyle w:val="Heading2"/>
@@ -4832,8 +5184,8 @@
         </w:tc>
       </w:tr>
     </w:tbl>
-    <w:bookmarkEnd w:id="48"/>
-    <w:bookmarkStart w:id="49" w:name="quản-lý-secret"/>
+    <w:bookmarkEnd w:id="59"/>
+    <w:bookmarkStart w:id="60" w:name="quản-lý-secret"/>
     <w:p>
       <w:pPr>
         <w:pStyle w:val="Heading2"/>
@@ -5180,8 +5532,8 @@
         <w:t xml:space="preserve">. Log không ghi PIN hay khóa. Log của lần smoke test (mục 6.5) chỉ có UUID người dùng và chương trình.</w:t>
       </w:r>
     </w:p>
-    <w:bookmarkEnd w:id="49"/>
-    <w:bookmarkStart w:id="50" w:name="đọc-cấu-hình-lúc-chạy-31-pr-32"/>
+    <w:bookmarkEnd w:id="60"/>
+    <w:bookmarkStart w:id="61" w:name="đọc-cấu-hình-lúc-chạy-31-pr-32"/>
     <w:p>
       <w:pPr>
         <w:pStyle w:val="Heading2"/>
@@ -5422,8 +5774,8 @@
         <w:t xml:space="preserve">Nhờ vậy gói v1.0.0 không bị gắn với một máy chủ Supabase cụ thể. Smoke test ở mục 6.5 xác nhận lại điều này: gói được build ngày 20/10 chạy được với một stack hoàn toàn mới ở cổng 563xx.</w:t>
       </w:r>
     </w:p>
-    <w:bookmarkEnd w:id="50"/>
-    <w:bookmarkStart w:id="51" w:name="bảng-kê-dependency-đã-cố-định-phiên-bản"/>
+    <w:bookmarkEnd w:id="61"/>
+    <w:bookmarkStart w:id="62" w:name="bảng-kê-dependency-đã-cố-định-phiên-bản"/>
     <w:p>
       <w:pPr>
         <w:pStyle w:val="Heading2"/>
@@ -6319,8 +6671,8 @@
         </w:tc>
       </w:tr>
     </w:tbl>
-    <w:bookmarkEnd w:id="51"/>
-    <w:bookmarkStart w:id="52" w:name="kiểm-tra-lỗ-hổng-npm-audit"/>
+    <w:bookmarkEnd w:id="62"/>
+    <w:bookmarkStart w:id="63" w:name="kiểm-tra-lỗ-hổng-npm-audit"/>
     <w:p>
       <w:pPr>
         <w:pStyle w:val="Heading2"/>
@@ -6849,9 +7201,9 @@
         <w:t xml:space="preserve">chưa làm trong TH2 (xem mục 8).</w:t>
       </w:r>
     </w:p>
-    <w:bookmarkEnd w:id="52"/>
-    <w:bookmarkEnd w:id="53"/>
-    <w:bookmarkStart w:id="59" w:name="continuous-integration"/>
+    <w:bookmarkEnd w:id="63"/>
+    <w:bookmarkEnd w:id="64"/>
+    <w:bookmarkStart w:id="73" w:name="continuous-integration"/>
     <w:p>
       <w:pPr>
         <w:pStyle w:val="Heading1"/>
@@ -6860,7 +7212,7 @@
         <w:t xml:space="preserve">5. Continuous Integration</w:t>
       </w:r>
     </w:p>
-    <w:bookmarkStart w:id="54" w:name="workflow-.githubworkflowsci.yml"/>
+    <w:bookmarkStart w:id="65" w:name="workflow-.githubworkflowsci.yml"/>
     <w:p>
       <w:pPr>
         <w:pStyle w:val="Heading2"/>
@@ -7758,8 +8110,8 @@
         <w:t xml:space="preserve">.</w:t>
       </w:r>
     </w:p>
-    <w:bookmarkEnd w:id="54"/>
-    <w:bookmarkStart w:id="55" w:name="mức-ci-và-lý-do"/>
+    <w:bookmarkEnd w:id="65"/>
+    <w:bookmarkStart w:id="66" w:name="mức-ci-và-lý-do"/>
     <w:p>
       <w:pPr>
         <w:pStyle w:val="Heading2"/>
@@ -7890,8 +8242,8 @@
         <w:t xml:space="preserve">trên bản build (mục 6.1) và smoke test (mục 6.5). Hai phần này cần web chạy cùng stack Supabase đầy đủ (Auth, Storage, Mailpit), có log làm bằng chứng. Chúng là kiểm thử bổ sung, không phải automated test bị đẩy ra khỏi CI.</w:t>
       </w:r>
     </w:p>
-    <w:bookmarkEnd w:id="55"/>
-    <w:bookmarkStart w:id="57" w:name="lần-chạy-thành-công"/>
+    <w:bookmarkEnd w:id="66"/>
+    <w:bookmarkStart w:id="71" w:name="lần-chạy-thành-công"/>
     <w:p>
       <w:pPr>
         <w:pStyle w:val="Heading2"/>
@@ -7910,7 +8262,7 @@
       <w:r>
         <w:t xml:space="preserve"> </w:t>
       </w:r>
-      <w:hyperlink r:id="rId56">
+      <w:hyperlink r:id="rId67">
         <w:r>
           <w:rPr>
             <w:rStyle w:val="Hyperlink"/>
@@ -8192,21 +8544,91 @@
         <w:pStyle w:val="BodyText"/>
       </w:pPr>
       <w:r>
-        <w:t xml:space="preserve">[ẢNH: evidence/ci-run-xanh.png – trang Actions của lần chạy 40737995933: hai job build-test và pgtap màu xanh, mục Artifacts có vitest-results và pgtap-results]</w:t>
-      </w:r>
-    </w:p>
-    <w:bookmarkEnd w:id="57"/>
-    <w:bookmarkStart w:id="58" w:name="ci-đỏ"/>
-    <w:p>
-      <w:pPr>
-        <w:pStyle w:val="Heading2"/>
-      </w:pPr>
-      <w:r>
-        <w:t xml:space="preserve">5.4 CI đỏ</w:t>
+        <w:t xml:space="preserve">Trang lần chạy có 2 annotation thật của GitHub: nhãn</w:t>
+      </w:r>
+      <w:r>
+        <w:t xml:space="preserve"> </w:t>
+      </w:r>
+      <w:r>
+        <w:rPr>
+          <w:rStyle w:val="VerbatimChar"/>
+        </w:rPr>
+        <w:t xml:space="preserve">ubuntu-latest</w:t>
+      </w:r>
+      <w:r>
+        <w:t xml:space="preserve"> </w:t>
+      </w:r>
+      <w:r>
+        <w:t xml:space="preserve">chuyển sang Ubuntu 26 từ 19/10/2026. CI vẫn xanh; cần theo dõi khi runner đổi image (Node 24 và Supabase CLI được cài lại ở mỗi lần chạy).</w:t>
       </w:r>
     </w:p>
     <w:p>
       <w:pPr>
+        <w:pStyle w:val="CaptionedFigure"/>
+      </w:pPr>
+      <w:r>
+        <w:drawing>
+          <wp:inline>
+            <wp:extent cx="5334000" cy="3081169"/>
+            <wp:effectExtent b="0" l="0" r="0" t="0"/>
+            <wp:docPr descr="Lần chạy 40737995933: hai job build-test, pgtap xanh; mục Artifacts có pgtap-results và vitest-results" title="" id="69" name="Picture"/>
+            <a:graphic>
+              <a:graphicData uri="http://schemas.openxmlformats.org/drawingml/2006/picture">
+                <pic:pic>
+                  <pic:nvPicPr>
+                    <pic:cNvPr descr="evidence/ci-run-xanh.png" id="70" name="Picture"/>
+                    <pic:cNvPicPr>
+                      <a:picLocks noChangeArrowheads="1" noChangeAspect="1"/>
+                    </pic:cNvPicPr>
+                  </pic:nvPicPr>
+                  <pic:blipFill>
+                    <a:blip r:embed="rId68"/>
+                    <a:stretch>
+                      <a:fillRect/>
+                    </a:stretch>
+                  </pic:blipFill>
+                  <pic:spPr bwMode="auto">
+                    <a:xfrm>
+                      <a:off x="0" y="0"/>
+                      <a:ext cx="5334000" cy="3081169"/>
+                    </a:xfrm>
+                    <a:prstGeom prst="rect">
+                      <a:avLst/>
+                    </a:prstGeom>
+                    <a:noFill/>
+                    <a:ln w="9525">
+                      <a:noFill/>
+                      <a:headEnd/>
+                      <a:tailEnd/>
+                    </a:ln>
+                  </pic:spPr>
+                </pic:pic>
+              </a:graphicData>
+            </a:graphic>
+          </wp:inline>
+        </w:drawing>
+      </w:r>
+    </w:p>
+    <w:p>
+      <w:pPr>
+        <w:pStyle w:val="ImageCaption"/>
+      </w:pPr>
+      <w:r>
+        <w:t xml:space="preserve">Lần chạy 40737995933: hai job build-test, pgtap xanh; mục Artifacts có pgtap-results và vitest-results</w:t>
+      </w:r>
+    </w:p>
+    <w:bookmarkEnd w:id="71"/>
+    <w:bookmarkStart w:id="72" w:name="ci-đỏ"/>
+    <w:p>
+      <w:pPr>
+        <w:pStyle w:val="Heading2"/>
+      </w:pPr>
+      <w:r>
+        <w:t xml:space="preserve">5.4 CI đỏ</w:t>
+      </w:r>
+    </w:p>
+    <w:p>
+      <w:pPr>
         <w:pStyle w:val="FirstParagraph"/>
       </w:pPr>
       <w:r>
@@ -8267,9 +8689,9 @@
         <w:t xml:space="preserve">Lỗi được chặn trước khi push: các PR sửa mã (#26, #30, #32, #36) ghi trong mô tả kết quả lint, typecheck và test chạy ở máy cá nhân trước khi mở PR, theo PR template.</w:t>
       </w:r>
     </w:p>
-    <w:bookmarkEnd w:id="58"/>
-    <w:bookmarkEnd w:id="59"/>
-    <w:bookmarkStart w:id="71" w:name="kiểm-thử-và-release-v1.0.0"/>
+    <w:bookmarkEnd w:id="72"/>
+    <w:bookmarkEnd w:id="73"/>
+    <w:bookmarkStart w:id="94" w:name="kiểm-thử-và-release-v1.0.0"/>
     <w:p>
       <w:pPr>
         <w:pStyle w:val="Heading1"/>
@@ -8278,7 +8700,7 @@
         <w:t xml:space="preserve">6. Kiểm thử và Release v1.0.0</w:t>
       </w:r>
     </w:p>
-    <w:bookmarkStart w:id="66" w:name="test-case-các-use-case-chính"/>
+    <w:bookmarkStart w:id="80" w:name="test-case-các-use-case-chính"/>
     <w:p>
       <w:pPr>
         <w:pStyle w:val="Heading2"/>
@@ -10031,18 +10453,18 @@
           <wp:inline>
             <wp:extent cx="4319999" cy="2719765"/>
             <wp:effectExtent b="0" l="0" r="0" t="0"/>
-            <wp:docPr descr="K1 sau khi sửa: trang đăng nhập mở từ link QR" title="" id="61" name="Picture"/>
+            <wp:docPr descr="K1 sau khi sửa: trang đăng nhập mở từ link QR" title="" id="75" name="Picture"/>
             <a:graphic>
               <a:graphicData uri="http://schemas.openxmlformats.org/drawingml/2006/picture">
                 <pic:pic>
                   <pic:nvPicPr>
-                    <pic:cNvPr descr="evidence/test-run/k1-ui/k1-1-trang-dang-nhap.png" id="62" name="Picture"/>
+                    <pic:cNvPr descr="evidence/test-run/k1-ui/k1-1-trang-dang-nhap.png" id="76" name="Picture"/>
                     <pic:cNvPicPr>
                       <a:picLocks noChangeArrowheads="1" noChangeAspect="1"/>
                     </pic:cNvPicPr>
                   </pic:nvPicPr>
                   <pic:blipFill>
-                    <a:blip r:embed="rId60"/>
+                    <a:blip r:embed="rId74"/>
                     <a:stretch>
                       <a:fillRect/>
                     </a:stretch>
@@ -10086,18 +10508,18 @@
           <wp:inline>
             <wp:extent cx="4319999" cy="2719765"/>
             <wp:effectExtent b="0" l="0" r="0" t="0"/>
-            <wp:docPr descr="K1 sau khi sửa: đăng nhập xong quay lại trang điểm danh" title="" id="64" name="Picture"/>
+            <wp:docPr descr="K1 sau khi sửa: đăng nhập xong quay lại trang điểm danh" title="" id="78" name="Picture"/>
             <a:graphic>
               <a:graphicData uri="http://schemas.openxmlformats.org/drawingml/2006/picture">
                 <pic:pic>
                   <pic:nvPicPr>
-                    <pic:cNvPr descr="evidence/test-run/k1-ui/k1-2-diem-danh-sau-dang-nhap.png" id="65" name="Picture"/>
+                    <pic:cNvPr descr="evidence/test-run/k1-ui/k1-2-diem-danh-sau-dang-nhap.png" id="79" name="Picture"/>
                     <pic:cNvPicPr>
                       <a:picLocks noChangeArrowheads="1" noChangeAspect="1"/>
                     </pic:cNvPicPr>
                   </pic:nvPicPr>
                   <pic:blipFill>
-                    <a:blip r:embed="rId63"/>
+                    <a:blip r:embed="rId77"/>
                     <a:stretch>
                       <a:fillRect/>
                     </a:stretch>
@@ -10132,8 +10554,8 @@
         <w:t xml:space="preserve">K1 sau khi sửa: đăng nhập xong quay lại trang điểm danh</w:t>
       </w:r>
     </w:p>
-    <w:bookmarkEnd w:id="66"/>
-    <w:bookmarkStart w:id="67" w:name="automated-test-trên-ci"/>
+    <w:bookmarkEnd w:id="80"/>
+    <w:bookmarkStart w:id="81" w:name="automated-test-trên-ci"/>
     <w:p>
       <w:pPr>
         <w:pStyle w:val="Heading2"/>
@@ -10448,8 +10870,8 @@
         <w:t xml:space="preserve">(#30). pgTAP vẫn là 205 assertion, nay chạy trên mỗi PR (trước đây chỉ chạy local, known issue K3).</w:t>
       </w:r>
     </w:p>
-    <w:bookmarkEnd w:id="67"/>
-    <w:bookmarkStart w:id="68" w:name="checklist-smoke-test"/>
+    <w:bookmarkEnd w:id="81"/>
+    <w:bookmarkStart w:id="82" w:name="checklist-smoke-test"/>
     <w:p>
       <w:pPr>
         <w:pStyle w:val="Heading2"/>
@@ -10944,8 +11366,8 @@
         </w:tc>
       </w:tr>
     </w:tbl>
-    <w:bookmarkEnd w:id="68"/>
-    <w:bookmarkStart w:id="69" w:name="release-v1.0.0"/>
+    <w:bookmarkEnd w:id="82"/>
+    <w:bookmarkStart w:id="89" w:name="release-v1.0.0"/>
     <w:p>
       <w:pPr>
         <w:pStyle w:val="Heading2"/>
@@ -11412,14 +11834,139 @@
     </w:tbl>
     <w:p>
       <w:pPr>
+        <w:pStyle w:val="CaptionedFigure"/>
+      </w:pPr>
+      <w:r>
+        <w:drawing>
+          <wp:inline>
+            <wp:extent cx="5334000" cy="3081169"/>
+            <wp:effectExtent b="0" l="0" r="0" t="0"/>
+            <wp:docPr descr="Trang GitHub Release v1.0.0: tag, commit fe2b984, đầu release notes và SHA-256 của gói" title="" id="84" name="Picture"/>
+            <a:graphic>
+              <a:graphicData uri="http://schemas.openxmlformats.org/drawingml/2006/picture">
+                <pic:pic>
+                  <pic:nvPicPr>
+                    <pic:cNvPr descr="evidence/release-v1.0.0.png" id="85" name="Picture"/>
+                    <pic:cNvPicPr>
+                      <a:picLocks noChangeArrowheads="1" noChangeAspect="1"/>
+                    </pic:cNvPicPr>
+                  </pic:nvPicPr>
+                  <pic:blipFill>
+                    <a:blip r:embed="rId83"/>
+                    <a:stretch>
+                      <a:fillRect/>
+                    </a:stretch>
+                  </pic:blipFill>
+                  <pic:spPr bwMode="auto">
+                    <a:xfrm>
+                      <a:off x="0" y="0"/>
+                      <a:ext cx="5334000" cy="3081169"/>
+                    </a:xfrm>
+                    <a:prstGeom prst="rect">
+                      <a:avLst/>
+                    </a:prstGeom>
+                    <a:noFill/>
+                    <a:ln w="9525">
+                      <a:noFill/>
+                      <a:headEnd/>
+                      <a:tailEnd/>
+                    </a:ln>
+                  </pic:spPr>
+                </pic:pic>
+              </a:graphicData>
+            </a:graphic>
+          </wp:inline>
+        </w:drawing>
+      </w:r>
+    </w:p>
+    <w:p>
+      <w:pPr>
+        <w:pStyle w:val="ImageCaption"/>
+      </w:pPr>
+      <w:r>
+        <w:t xml:space="preserve">Trang GitHub Release v1.0.0: tag, commit fe2b984, đầu release notes và SHA-256 của gói</w:t>
+      </w:r>
+    </w:p>
+    <w:p>
+      <w:pPr>
         <w:pStyle w:val="BodyText"/>
       </w:pPr>
       <w:r>
-        <w:t xml:space="preserve">[ẢNH: evidence/release-v1.0.0.png – trang GitHub Release v1.0.0: tiêu đề, release notes, mục Assets có file .zip và .sha256]</w:t>
+        <w:t xml:space="preserve">Mục Assets nằm cuối trang Release. Ảnh dưới chụp trang</w:t>
+      </w:r>
+      <w:r>
+        <w:t xml:space="preserve"> </w:t>
+      </w:r>
+      <w:r>
+        <w:rPr>
+          <w:rStyle w:val="VerbatimChar"/>
+        </w:rPr>
+        <w:t xml:space="preserve">releases/expanded_assets/v1.0.0</w:t>
+      </w:r>
+      <w:r>
+        <w:t xml:space="preserve"> </w:t>
+      </w:r>
+      <w:r>
+        <w:t xml:space="preserve">của GitHub: đây là phần GitHub nạp vào mục Assets, mở trực tiếp nên không có giao diện.</w:t>
       </w:r>
     </w:p>
-    <w:bookmarkEnd w:id="69"/>
-    <w:bookmarkStart w:id="70" w:name="smoke-test-trên-artifact"/>
+    <w:p>
+      <w:pPr>
+        <w:pStyle w:val="CaptionedFigure"/>
+      </w:pPr>
+      <w:r>
+        <w:drawing>
+          <wp:inline>
+            <wp:extent cx="4319999" cy="1473882"/>
+            <wp:effectExtent b="0" l="0" r="0" t="0"/>
+            <wp:docPr descr="Assets của v1.0.0: hiu-youth-e-office-v1.0.0.zip (8,4 MB) và .zip.sha256, kèm mã nguồn zip/tar.gz" title="" id="87" name="Picture"/>
+            <a:graphic>
+              <a:graphicData uri="http://schemas.openxmlformats.org/drawingml/2006/picture">
+                <pic:pic>
+                  <pic:nvPicPr>
+                    <pic:cNvPr descr="evidence/release-v1.0.0-assets.png" id="88" name="Picture"/>
+                    <pic:cNvPicPr>
+                      <a:picLocks noChangeArrowheads="1" noChangeAspect="1"/>
+                    </pic:cNvPicPr>
+                  </pic:nvPicPr>
+                  <pic:blipFill>
+                    <a:blip r:embed="rId86"/>
+                    <a:stretch>
+                      <a:fillRect/>
+                    </a:stretch>
+                  </pic:blipFill>
+                  <pic:spPr bwMode="auto">
+                    <a:xfrm>
+                      <a:off x="0" y="0"/>
+                      <a:ext cx="4319999" cy="1473882"/>
+                    </a:xfrm>
+                    <a:prstGeom prst="rect">
+                      <a:avLst/>
+                    </a:prstGeom>
+                    <a:noFill/>
+                    <a:ln w="9525">
+                      <a:noFill/>
+                      <a:headEnd/>
+                      <a:tailEnd/>
+                    </a:ln>
+                  </pic:spPr>
+                </pic:pic>
+              </a:graphicData>
+            </a:graphic>
+          </wp:inline>
+        </w:drawing>
+      </w:r>
+    </w:p>
+    <w:p>
+      <w:pPr>
+        <w:pStyle w:val="ImageCaption"/>
+      </w:pPr>
+      <w:r>
+        <w:t xml:space="preserve">Assets của v1.0.0: hiu-youth-e-office-v1.0.0.zip (8,4 MB) và .zip.sha256, kèm mã nguồn zip/tar.gz</w:t>
+      </w:r>
+    </w:p>
+    <w:bookmarkEnd w:id="89"/>
+    <w:bookmarkStart w:id="93" w:name="smoke-test-trên-artifact"/>
     <w:p>
       <w:pPr>
         <w:pStyle w:val="Heading2"/>
@@ -12490,15 +13037,127 @@
     </w:p>
     <w:p>
       <w:pPr>
-        <w:pStyle w:val="FirstParagraph"/>
-      </w:pPr>
-      <w:r>
-        <w:t xml:space="preserve">[ẢNH: evidence/smoke-artifact/smoke-dang-ky-thanh-cong.png – bản cài từ gói v1.0.0 ở http://localhost:3300: trang chương trình sau khi đăng ký, thanh trên có họ tên và MSSV]</w:t>
+        <w:pStyle w:val="CaptionedFigure"/>
+      </w:pPr>
+      <w:r>
+        <w:drawing>
+          <wp:inline>
+            <wp:extent cx="5039999" cy="3553089"/>
+            <wp:effectExtent b="0" l="0" r="0" t="0"/>
+            <wp:docPr descr="Bản cài từ gói v1.0.0 tại http://localhost:3300 (tài khoản demo 2241110104): trang “Ngày hội Hiến máu” sau khi đăng ký, trạng thái Đã xác nhận" title="" id="91" name="Picture"/>
+            <a:graphic>
+              <a:graphicData uri="http://schemas.openxmlformats.org/drawingml/2006/picture">
+                <pic:pic>
+                  <pic:nvPicPr>
+                    <pic:cNvPr descr="evidence/smoke-artifact/smoke-dang-ky-thanh-cong.png" id="92" name="Picture"/>
+                    <pic:cNvPicPr>
+                      <a:picLocks noChangeArrowheads="1" noChangeAspect="1"/>
+                    </pic:cNvPicPr>
+                  </pic:nvPicPr>
+                  <pic:blipFill>
+                    <a:blip r:embed="rId90"/>
+                    <a:stretch>
+                      <a:fillRect/>
+                    </a:stretch>
+                  </pic:blipFill>
+                  <pic:spPr bwMode="auto">
+                    <a:xfrm>
+                      <a:off x="0" y="0"/>
+                      <a:ext cx="5039999" cy="3553089"/>
+                    </a:xfrm>
+                    <a:prstGeom prst="rect">
+                      <a:avLst/>
+                    </a:prstGeom>
+                    <a:noFill/>
+                    <a:ln w="9525">
+                      <a:noFill/>
+                      <a:headEnd/>
+                      <a:tailEnd/>
+                    </a:ln>
+                  </pic:spPr>
+                </pic:pic>
+              </a:graphicData>
+            </a:graphic>
+          </wp:inline>
+        </w:drawing>
       </w:r>
     </w:p>
-    <w:bookmarkEnd w:id="70"/>
-    <w:bookmarkEnd w:id="71"/>
-    <w:bookmarkStart w:id="78" w:name="vấn-đề-gặp-phải-và-cách-xử-lý"/>
+    <w:p>
+      <w:pPr>
+        <w:pStyle w:val="ImageCaption"/>
+      </w:pPr>
+      <w:r>
+        <w:t xml:space="preserve">Bản cài từ gói v1.0.0 tại http://localhost:3300 (tài khoản demo 2241110104): trang</w:t>
+      </w:r>
+      <w:r>
+        <w:t xml:space="preserve"> </w:t>
+      </w:r>
+      <w:r>
+        <w:t xml:space="preserve">“Ngày hội Hiến máu”</w:t>
+      </w:r>
+      <w:r>
+        <w:t xml:space="preserve"> </w:t>
+      </w:r>
+      <w:r>
+        <w:t xml:space="preserve">sau khi đăng ký, trạng thái Đã xác nhận</w:t>
+      </w:r>
+    </w:p>
+    <w:p>
+      <w:pPr>
+        <w:pStyle w:val="BodyText"/>
+      </w:pPr>
+      <w:r>
+        <w:t xml:space="preserve">Ảnh chụp bằng Playwright (</w:t>
+      </w:r>
+      <w:r>
+        <w:rPr>
+          <w:rStyle w:val="VerbatimChar"/>
+        </w:rPr>
+        <w:t xml:space="preserve">evidence/smoke-artifact/smoke-screenshot.mjs</w:t>
+      </w:r>
+      <w:r>
+        <w:t xml:space="preserve">) trên bản cài từ gói v1.0.0 tại</w:t>
+      </w:r>
+      <w:r>
+        <w:t xml:space="preserve"> </w:t>
+      </w:r>
+      <w:r>
+        <w:rPr>
+          <w:rStyle w:val="VerbatimChar"/>
+        </w:rPr>
+        <w:t xml:space="preserve">http://localhost:3300</w:t>
+      </w:r>
+      <w:r>
+        <w:t xml:space="preserve">, stack</w:t>
+      </w:r>
+      <w:r>
+        <w:t xml:space="preserve"> </w:t>
+      </w:r>
+      <w:r>
+        <w:rPr>
+          <w:rStyle w:val="VerbatimChar"/>
+        </w:rPr>
+        <w:t xml:space="preserve">eoffice-v100</w:t>
+      </w:r>
+      <w:r>
+        <w:t xml:space="preserve">. Trong container Playwright, địa chỉ này là</w:t>
+      </w:r>
+      <w:r>
+        <w:t xml:space="preserve"> </w:t>
+      </w:r>
+      <w:r>
+        <w:rPr>
+          <w:rStyle w:val="VerbatimChar"/>
+        </w:rPr>
+        <w:t xml:space="preserve">host.docker.internal:3300</w:t>
+      </w:r>
+      <w:r>
+        <w:t xml:space="preserve">. Đăng ký của tài khoản này được tạo ở lần chạy bước 5–8 đầu tiên (00:37 29/10/2026).</w:t>
+      </w:r>
+    </w:p>
+    <w:bookmarkEnd w:id="93"/>
+    <w:bookmarkEnd w:id="94"/>
+    <w:bookmarkStart w:id="101" w:name="vấn-đề-gặp-phải-và-cách-xử-lý"/>
     <w:p>
       <w:pPr>
         <w:pStyle w:val="Heading1"/>
@@ -13668,6 +14327,145 @@
           </w:p>
         </w:tc>
       </w:tr>
+      <w:tr>
+        <w:tc>
+          <w:tcPr/>
+          <w:p>
+            <w:pPr>
+              <w:pStyle w:val="Compact"/>
+            </w:pPr>
+            <w:r>
+              <w:t xml:space="preserve">Bằng chứng</w:t>
+            </w:r>
+          </w:p>
+        </w:tc>
+        <w:tc>
+          <w:tcPr/>
+          <w:p>
+            <w:pPr>
+              <w:pStyle w:val="Compact"/>
+            </w:pPr>
+            <w:r>
+              <w:t xml:space="preserve">Chụp màn hình bằng</w:t>
+            </w:r>
+            <w:r>
+              <w:t xml:space="preserve"> </w:t>
+            </w:r>
+            <w:r>
+              <w:rPr>
+                <w:rStyle w:val="VerbatimChar"/>
+              </w:rPr>
+              <w:t xml:space="preserve">screencapture</w:t>
+            </w:r>
+            <w:r>
+              <w:t xml:space="preserve"> </w:t>
+            </w:r>
+            <w:r>
+              <w:t xml:space="preserve">chỉ ra hình nền desktop: ứng dụng chạy lệnh chưa có quyền Screen Recording</w:t>
+            </w:r>
+          </w:p>
+        </w:tc>
+        <w:tc>
+          <w:tcPr/>
+          <w:p>
+            <w:pPr>
+              <w:pStyle w:val="Compact"/>
+            </w:pPr>
+            <w:r>
+              <w:t xml:space="preserve">Cấp quyền trong System Settings → Privacy &amp; Security → Screen Recording, mở lại ứng dụng rồi chụp lại</w:t>
+            </w:r>
+          </w:p>
+        </w:tc>
+      </w:tr>
+      <w:tr>
+        <w:tc>
+          <w:tcPr/>
+          <w:p>
+            <w:pPr>
+              <w:pStyle w:val="Compact"/>
+            </w:pPr>
+            <w:r>
+              <w:t xml:space="preserve">Bằng chứng</w:t>
+            </w:r>
+          </w:p>
+        </w:tc>
+        <w:tc>
+          <w:tcPr/>
+          <w:p>
+            <w:pPr>
+              <w:pStyle w:val="Compact"/>
+            </w:pPr>
+            <w:r>
+              <w:t xml:space="preserve">Không cuộn được trang GitHub để chụp phần dưới (macOS chặn gửi phím, trình duyệt tắt JavaScript từ AppleScript);</w:t>
+            </w:r>
+            <w:r>
+              <w:t xml:space="preserve"> </w:t>
+            </w:r>
+            <w:r>
+              <w:rPr>
+                <w:rStyle w:val="VerbatimChar"/>
+              </w:rPr>
+              <w:t xml:space="preserve">sips --cropOffset</w:t>
+            </w:r>
+            <w:r>
+              <w:t xml:space="preserve"> </w:t>
+            </w:r>
+            <w:r>
+              <w:t xml:space="preserve">cắt sai vùng</w:t>
+            </w:r>
+          </w:p>
+        </w:tc>
+        <w:tc>
+          <w:tcPr/>
+          <w:p>
+            <w:pPr>
+              <w:pStyle w:val="Compact"/>
+            </w:pPr>
+            <w:r>
+              <w:t xml:space="preserve">Chụp theo vùng màn hình (</w:t>
+            </w:r>
+            <w:r>
+              <w:rPr>
+                <w:rStyle w:val="VerbatimChar"/>
+              </w:rPr>
+              <w:t xml:space="preserve">screencapture -R</w:t>
+            </w:r>
+            <w:r>
+              <w:t xml:space="preserve">) bỏ thanh tab; mở URL có neo</w:t>
+            </w:r>
+            <w:r>
+              <w:t xml:space="preserve"> </w:t>
+            </w:r>
+            <w:r>
+              <w:rPr>
+                <w:rStyle w:val="VerbatimChar"/>
+              </w:rPr>
+              <w:t xml:space="preserve">#artifacts</w:t>
+            </w:r>
+            <w:r>
+              <w:t xml:space="preserve"> </w:t>
+            </w:r>
+            <w:r>
+              <w:t xml:space="preserve">cho trang CI và trang</w:t>
+            </w:r>
+            <w:r>
+              <w:t xml:space="preserve"> </w:t>
+            </w:r>
+            <w:r>
+              <w:rPr>
+                <w:rStyle w:val="VerbatimChar"/>
+              </w:rPr>
+              <w:t xml:space="preserve">expanded_assets</w:t>
+            </w:r>
+            <w:r>
+              <w:t xml:space="preserve"> </w:t>
+            </w:r>
+            <w:r>
+              <w:t xml:space="preserve">cho mục Assets của Release</w:t>
+            </w:r>
+          </w:p>
+        </w:tc>
+      </w:tr>
     </w:tbl>
     <w:p>
       <w:pPr>
@@ -13730,18 +14528,18 @@
                 <wp:inline>
                   <wp:extent cx="2879999" cy="1849019"/>
                   <wp:effectExtent b="0" l="0" r="0" t="0"/>
-                  <wp:docPr descr="" title="" id="73" name="Picture"/>
+                  <wp:docPr descr="" title="" id="96" name="Picture"/>
                   <a:graphic>
                     <a:graphicData uri="http://schemas.openxmlformats.org/drawingml/2006/picture">
                       <pic:pic>
                         <pic:nvPicPr>
-                          <pic:cNvPr descr="evidence/ui/home-truoc-khach-desktop.png" id="74" name="Picture"/>
+                          <pic:cNvPr descr="evidence/ui/home-truoc-khach-desktop.png" id="97" name="Picture"/>
                           <pic:cNvPicPr>
                             <a:picLocks noChangeArrowheads="1" noChangeAspect="1"/>
                           </pic:cNvPicPr>
                         </pic:nvPicPr>
                         <pic:blipFill>
-                          <a:blip r:embed="rId72"/>
+                          <a:blip r:embed="rId95"/>
                           <a:stretch>
                             <a:fillRect/>
                           </a:stretch>
@@ -13781,18 +14579,18 @@
                 <wp:inline>
                   <wp:extent cx="2879999" cy="1849019"/>
                   <wp:effectExtent b="0" l="0" r="0" t="0"/>
-                  <wp:docPr descr="" title="" id="76" name="Picture"/>
+                  <wp:docPr descr="" title="" id="99" name="Picture"/>
                   <a:graphic>
                     <a:graphicData uri="http://schemas.openxmlformats.org/drawingml/2006/picture">
                       <pic:pic>
                         <pic:nvPicPr>
-                          <pic:cNvPr descr="evidence/ui/home-sau-khach-desktop.png" id="77" name="Picture"/>
+                          <pic:cNvPr descr="evidence/ui/home-sau-khach-desktop.png" id="100" name="Picture"/>
                           <pic:cNvPicPr>
                             <a:picLocks noChangeArrowheads="1" noChangeAspect="1"/>
                           </pic:cNvPicPr>
                         </pic:nvPicPr>
                         <pic:blipFill>
-                          <a:blip r:embed="rId75"/>
+                          <a:blip r:embed="rId98"/>
                           <a:stretch>
                             <a:fillRect/>
                           </a:stretch>
@@ -14158,8 +14956,8 @@
         <w:t xml:space="preserve">). Lịch sử không viết lại. Từ PR #34, mô tả PR và commit không còn dòng này.</w:t>
       </w:r>
     </w:p>
-    <w:bookmarkEnd w:id="78"/>
-    <w:bookmarkStart w:id="79" w:name="nhận-xét-và-kết-luận"/>
+    <w:bookmarkEnd w:id="101"/>
+    <w:bookmarkStart w:id="102" w:name="nhận-xét-và-kết-luận"/>
     <w:p>
       <w:pPr>
         <w:pStyle w:val="Heading1"/>
@@ -14189,7 +14987,7 @@
         </w:numPr>
       </w:pPr>
       <w:r>
-        <w:t xml:space="preserve">Quy trình Git của môn áp dụng cho cả 9 PR đã merge của Milestone TH2 và PR báo cáo này.</w:t>
+        <w:t xml:space="preserve">Quy trình Git của môn áp dụng cho mọi PR của Milestone TH2 (#22–#41 và PR chèn ảnh).</w:t>
       </w:r>
       <w:r>
         <w:t xml:space="preserve"> </w:t>
@@ -14204,7 +15002,7 @@
         <w:t xml:space="preserve"> </w:t>
       </w:r>
       <w:r>
-        <w:t xml:space="preserve">rỗng. Mọi issue tạo bằng issue form.</w:t>
+        <w:t xml:space="preserve">rỗng. Từ #23, mọi issue tạo bằng issue form.</w:t>
       </w:r>
     </w:p>
     <w:p>
@@ -14802,7 +15600,7 @@
         <w:t xml:space="preserve">Hệ thống ở trạng thái phát hành được: v1.0.0 có tag, Release, gói build sẵn và smoke test đạt trên gói đó. CI mức A bảo vệ mọi thay đổi tiếp theo. TH2 nộp trễ so với hạn 26/10/2026; issue CR-01 tạo sau hạn 25/10/2026 và đang chờ giảng viên phản hồi.</w:t>
       </w:r>
     </w:p>
-    <w:bookmarkEnd w:id="79"/>
+    <w:bookmarkEnd w:id="102"/>
     <w:sectPr>
       <w:footnotePr>
         <w:numRestart w:val="eachSect"/>

</xml_diff>